<commit_message>
Se actualizan los resultados 2.
</commit_message>
<xml_diff>
--- a/borrador_articulo.docx
+++ b/borrador_articulo.docx
@@ -5752,19 +5752,19 @@
       <w:pPr>
         <w:pStyle w:val="Normal"/>
         <w:bidi w:val="0"/>
+        <w:spacing w:before="0" w:after="0"/>
         <w:jc w:val="both"/>
         <w:rPr>
-          <w:b w:val="false"/>
-          <w:b w:val="false"/>
-          <w:bCs w:val="false"/>
-          <w:i w:val="false"/>
-          <w:i w:val="false"/>
-          <w:caps w:val="false"/>
-          <w:smallCaps w:val="false"/>
-          <w:color w:val="000000"/>
-          <w:spacing w:val="0"/>
-          <w:sz w:val="24"/>
-          <w:szCs w:val="24"/>
+          <w:rFonts w:ascii="Liberation Serif" w:hAnsi="Liberation Serif"/>
+          <w:b w:val="false"/>
+          <w:b w:val="false"/>
+          <w:i w:val="false"/>
+          <w:i w:val="false"/>
+          <w:caps w:val="false"/>
+          <w:smallCaps w:val="false"/>
+          <w:color w:val="000000"/>
+          <w:spacing w:val="0"/>
+          <w:sz w:val="24"/>
         </w:rPr>
       </w:pPr>
       <w:r>
@@ -5780,7 +5780,7 @@
           <w:szCs w:val="24"/>
         </w:rPr>
         <w:drawing>
-          <wp:anchor behindDoc="0" distT="0" distB="0" distL="0" distR="0" simplePos="0" locked="0" layoutInCell="0" allowOverlap="1" relativeHeight="3">
+          <wp:anchor behindDoc="0" distT="0" distB="0" distL="0" distR="0" simplePos="0" locked="0" layoutInCell="0" allowOverlap="1" relativeHeight="80">
             <wp:simplePos x="0" y="0"/>
             <wp:positionH relativeFrom="column">
               <wp:align>center</wp:align>
@@ -7958,7 +7958,7 @@
           <w:szCs w:val="20"/>
         </w:rPr>
         <w:drawing>
-          <wp:anchor behindDoc="0" distT="0" distB="0" distL="0" distR="0" simplePos="0" locked="0" layoutInCell="0" allowOverlap="1" relativeHeight="4">
+          <wp:anchor behindDoc="0" distT="0" distB="0" distL="0" distR="0" simplePos="0" locked="0" layoutInCell="0" allowOverlap="1" relativeHeight="3">
             <wp:simplePos x="0" y="0"/>
             <wp:positionH relativeFrom="column">
               <wp:align>center</wp:align>
@@ -10034,7 +10034,7 @@
           <w:szCs w:val="20"/>
         </w:rPr>
         <w:drawing>
-          <wp:anchor behindDoc="0" distT="0" distB="0" distL="0" distR="0" simplePos="0" locked="0" layoutInCell="0" allowOverlap="1" relativeHeight="5">
+          <wp:anchor behindDoc="0" distT="0" distB="0" distL="0" distR="0" simplePos="0" locked="0" layoutInCell="0" allowOverlap="1" relativeHeight="4">
             <wp:simplePos x="0" y="0"/>
             <wp:positionH relativeFrom="column">
               <wp:align>center</wp:align>

</xml_diff>

<commit_message>
Se actualizan los análisis 2.
</commit_message>
<xml_diff>
--- a/borrador_articulo.docx
+++ b/borrador_articulo.docx
@@ -5777,51 +5777,37 @@
           <w:spacing w:val="0"/>
           <w:sz w:val="24"/>
         </w:rPr>
-        <w:drawing>
-          <wp:anchor behindDoc="0" distT="0" distB="0" distL="0" distR="0" simplePos="0" locked="0" layoutInCell="0" allowOverlap="1" relativeHeight="5">
-            <wp:simplePos x="0" y="0"/>
-            <wp:positionH relativeFrom="column">
-              <wp:align>center</wp:align>
-            </wp:positionH>
-            <wp:positionV relativeFrom="paragraph">
-              <wp:posOffset>635</wp:posOffset>
-            </wp:positionV>
-            <wp:extent cx="6332220" cy="3161665"/>
-            <wp:effectExtent l="0" t="0" r="0" b="0"/>
-            <wp:wrapSquare wrapText="largest"/>
-            <wp:docPr id="2" name="Imagen1" descr=""/>
-            <wp:cNvGraphicFramePr>
-              <a:graphicFrameLocks xmlns:a="http://schemas.openxmlformats.org/drawingml/2006/main" noChangeAspect="1"/>
-            </wp:cNvGraphicFramePr>
-            <a:graphic xmlns:a="http://schemas.openxmlformats.org/drawingml/2006/main">
-              <a:graphicData uri="http://schemas.openxmlformats.org/drawingml/2006/picture">
-                <pic:pic xmlns:pic="http://schemas.openxmlformats.org/drawingml/2006/picture">
-                  <pic:nvPicPr>
-                    <pic:cNvPr id="2" name="Imagen1" descr=""/>
-                    <pic:cNvPicPr>
-                      <a:picLocks noChangeAspect="1" noChangeArrowheads="1"/>
-                    </pic:cNvPicPr>
-                  </pic:nvPicPr>
-                  <pic:blipFill>
-                    <a:blip r:embed="rId3"/>
-                    <a:stretch>
-                      <a:fillRect/>
-                    </a:stretch>
-                  </pic:blipFill>
-                  <pic:spPr bwMode="auto">
-                    <a:xfrm>
-                      <a:off x="0" y="0"/>
-                      <a:ext cx="6332220" cy="3161665"/>
-                    </a:xfrm>
-                    <a:prstGeom prst="rect">
-                      <a:avLst/>
-                    </a:prstGeom>
-                  </pic:spPr>
-                </pic:pic>
-              </a:graphicData>
-            </a:graphic>
-          </wp:anchor>
-        </w:drawing>
+      </w:r>
+    </w:p>
+    <w:p>
+      <w:pPr>
+        <w:pStyle w:val="Normal"/>
+        <w:bidi w:val="0"/>
+        <w:spacing w:before="0" w:after="0"/>
+        <w:jc w:val="both"/>
+        <w:rPr>
+          <w:rFonts w:ascii="Liberation Serif" w:hAnsi="Liberation Serif"/>
+          <w:b w:val="false"/>
+          <w:b w:val="false"/>
+          <w:i w:val="false"/>
+          <w:i w:val="false"/>
+          <w:caps w:val="false"/>
+          <w:smallCaps w:val="false"/>
+          <w:color w:val="000000"/>
+          <w:spacing w:val="0"/>
+          <w:sz w:val="24"/>
+        </w:rPr>
+      </w:pPr>
+      <w:r>
+        <w:rPr>
+          <w:b w:val="false"/>
+          <w:i w:val="false"/>
+          <w:caps w:val="false"/>
+          <w:smallCaps w:val="false"/>
+          <w:color w:val="000000"/>
+          <w:spacing w:val="0"/>
+          <w:sz w:val="24"/>
+        </w:rPr>
       </w:r>
     </w:p>
     <w:p>
@@ -7939,6 +7925,40 @@
           <w:smallCaps w:val="false"/>
           <w:color w:val="000000"/>
           <w:spacing w:val="0"/>
+          <w:sz w:val="24"/>
+          <w:szCs w:val="24"/>
+        </w:rPr>
+      </w:pPr>
+      <w:r>
+        <w:rPr>
+          <w:b w:val="false"/>
+          <w:bCs w:val="false"/>
+          <w:i w:val="false"/>
+          <w:caps w:val="false"/>
+          <w:smallCaps w:val="false"/>
+          <w:color w:val="000000"/>
+          <w:spacing w:val="0"/>
+          <w:sz w:val="24"/>
+          <w:szCs w:val="24"/>
+        </w:rPr>
+      </w:r>
+    </w:p>
+    <w:p>
+      <w:pPr>
+        <w:pStyle w:val="Normal"/>
+        <w:bidi w:val="0"/>
+        <w:spacing w:before="0" w:after="0"/>
+        <w:jc w:val="both"/>
+        <w:rPr>
+          <w:b w:val="false"/>
+          <w:b w:val="false"/>
+          <w:bCs w:val="false"/>
+          <w:i w:val="false"/>
+          <w:i w:val="false"/>
+          <w:caps w:val="false"/>
+          <w:smallCaps w:val="false"/>
+          <w:color w:val="000000"/>
+          <w:spacing w:val="0"/>
           <w:sz w:val="20"/>
           <w:szCs w:val="20"/>
         </w:rPr>
@@ -7955,51 +7975,6 @@
           <w:sz w:val="20"/>
           <w:szCs w:val="20"/>
         </w:rPr>
-        <w:drawing>
-          <wp:anchor behindDoc="0" distT="0" distB="0" distL="0" distR="0" simplePos="0" locked="0" layoutInCell="0" allowOverlap="1" relativeHeight="3">
-            <wp:simplePos x="0" y="0"/>
-            <wp:positionH relativeFrom="column">
-              <wp:align>center</wp:align>
-            </wp:positionH>
-            <wp:positionV relativeFrom="paragraph">
-              <wp:posOffset>635</wp:posOffset>
-            </wp:positionV>
-            <wp:extent cx="6332220" cy="3161665"/>
-            <wp:effectExtent l="0" t="0" r="0" b="0"/>
-            <wp:wrapSquare wrapText="largest"/>
-            <wp:docPr id="3" name="Imagen2" descr=""/>
-            <wp:cNvGraphicFramePr>
-              <a:graphicFrameLocks xmlns:a="http://schemas.openxmlformats.org/drawingml/2006/main" noChangeAspect="1"/>
-            </wp:cNvGraphicFramePr>
-            <a:graphic xmlns:a="http://schemas.openxmlformats.org/drawingml/2006/main">
-              <a:graphicData uri="http://schemas.openxmlformats.org/drawingml/2006/picture">
-                <pic:pic xmlns:pic="http://schemas.openxmlformats.org/drawingml/2006/picture">
-                  <pic:nvPicPr>
-                    <pic:cNvPr id="3" name="Imagen2" descr=""/>
-                    <pic:cNvPicPr>
-                      <a:picLocks noChangeAspect="1" noChangeArrowheads="1"/>
-                    </pic:cNvPicPr>
-                  </pic:nvPicPr>
-                  <pic:blipFill>
-                    <a:blip r:embed="rId4"/>
-                    <a:stretch>
-                      <a:fillRect/>
-                    </a:stretch>
-                  </pic:blipFill>
-                  <pic:spPr bwMode="auto">
-                    <a:xfrm>
-                      <a:off x="0" y="0"/>
-                      <a:ext cx="6332220" cy="3161665"/>
-                    </a:xfrm>
-                    <a:prstGeom prst="rect">
-                      <a:avLst/>
-                    </a:prstGeom>
-                  </pic:spPr>
-                </pic:pic>
-              </a:graphicData>
-            </a:graphic>
-          </wp:anchor>
-        </w:drawing>
       </w:r>
     </w:p>
     <w:p>
@@ -10015,6 +9990,40 @@
           <w:smallCaps w:val="false"/>
           <w:color w:val="000000"/>
           <w:spacing w:val="0"/>
+          <w:sz w:val="24"/>
+          <w:szCs w:val="24"/>
+        </w:rPr>
+      </w:pPr>
+      <w:r>
+        <w:rPr>
+          <w:b w:val="false"/>
+          <w:bCs w:val="false"/>
+          <w:i w:val="false"/>
+          <w:caps w:val="false"/>
+          <w:smallCaps w:val="false"/>
+          <w:color w:val="000000"/>
+          <w:spacing w:val="0"/>
+          <w:sz w:val="24"/>
+          <w:szCs w:val="24"/>
+        </w:rPr>
+      </w:r>
+    </w:p>
+    <w:p>
+      <w:pPr>
+        <w:pStyle w:val="Normal"/>
+        <w:bidi w:val="0"/>
+        <w:spacing w:before="0" w:after="0"/>
+        <w:jc w:val="both"/>
+        <w:rPr>
+          <w:b w:val="false"/>
+          <w:b w:val="false"/>
+          <w:bCs w:val="false"/>
+          <w:i w:val="false"/>
+          <w:i w:val="false"/>
+          <w:caps w:val="false"/>
+          <w:smallCaps w:val="false"/>
+          <w:color w:val="000000"/>
+          <w:spacing w:val="0"/>
           <w:sz w:val="20"/>
           <w:szCs w:val="20"/>
         </w:rPr>
@@ -10031,51 +10040,6 @@
           <w:sz w:val="20"/>
           <w:szCs w:val="20"/>
         </w:rPr>
-        <w:drawing>
-          <wp:anchor behindDoc="0" distT="0" distB="0" distL="0" distR="0" simplePos="0" locked="0" layoutInCell="0" allowOverlap="1" relativeHeight="4">
-            <wp:simplePos x="0" y="0"/>
-            <wp:positionH relativeFrom="column">
-              <wp:align>center</wp:align>
-            </wp:positionH>
-            <wp:positionV relativeFrom="paragraph">
-              <wp:posOffset>635</wp:posOffset>
-            </wp:positionV>
-            <wp:extent cx="6332220" cy="3161665"/>
-            <wp:effectExtent l="0" t="0" r="0" b="0"/>
-            <wp:wrapSquare wrapText="largest"/>
-            <wp:docPr id="4" name="Imagen4" descr=""/>
-            <wp:cNvGraphicFramePr>
-              <a:graphicFrameLocks xmlns:a="http://schemas.openxmlformats.org/drawingml/2006/main" noChangeAspect="1"/>
-            </wp:cNvGraphicFramePr>
-            <a:graphic xmlns:a="http://schemas.openxmlformats.org/drawingml/2006/main">
-              <a:graphicData uri="http://schemas.openxmlformats.org/drawingml/2006/picture">
-                <pic:pic xmlns:pic="http://schemas.openxmlformats.org/drawingml/2006/picture">
-                  <pic:nvPicPr>
-                    <pic:cNvPr id="4" name="Imagen4" descr=""/>
-                    <pic:cNvPicPr>
-                      <a:picLocks noChangeAspect="1" noChangeArrowheads="1"/>
-                    </pic:cNvPicPr>
-                  </pic:nvPicPr>
-                  <pic:blipFill>
-                    <a:blip r:embed="rId5"/>
-                    <a:stretch>
-                      <a:fillRect/>
-                    </a:stretch>
-                  </pic:blipFill>
-                  <pic:spPr bwMode="auto">
-                    <a:xfrm>
-                      <a:off x="0" y="0"/>
-                      <a:ext cx="6332220" cy="3161665"/>
-                    </a:xfrm>
-                    <a:prstGeom prst="rect">
-                      <a:avLst/>
-                    </a:prstGeom>
-                  </pic:spPr>
-                </pic:pic>
-              </a:graphicData>
-            </a:graphic>
-          </wp:anchor>
-        </w:drawing>
       </w:r>
     </w:p>
     <w:p>
@@ -10368,10 +10332,10 @@
       </w:tblPr>
       <w:tblGrid>
         <w:gridCol w:w="1988"/>
-        <w:gridCol w:w="1989"/>
-        <w:gridCol w:w="1999"/>
-        <w:gridCol w:w="1991"/>
-        <w:gridCol w:w="2005"/>
+        <w:gridCol w:w="1988"/>
+        <w:gridCol w:w="2000"/>
+        <w:gridCol w:w="1990"/>
+        <w:gridCol w:w="2006"/>
       </w:tblGrid>
       <w:tr>
         <w:trPr/>
@@ -10556,7 +10520,7 @@
         </w:tc>
         <w:tc>
           <w:tcPr>
-            <w:tcW w:w="1989" w:type="dxa"/>
+            <w:tcW w:w="1988" w:type="dxa"/>
             <w:tcBorders>
               <w:bottom w:val="single" w:sz="4" w:space="0" w:color="000000"/>
             </w:tcBorders>
@@ -10611,7 +10575,7 @@
         </w:tc>
         <w:tc>
           <w:tcPr>
-            <w:tcW w:w="1999" w:type="dxa"/>
+            <w:tcW w:w="2000" w:type="dxa"/>
             <w:tcBorders>
               <w:bottom w:val="single" w:sz="4" w:space="0" w:color="000000"/>
             </w:tcBorders>
@@ -10666,7 +10630,7 @@
         </w:tc>
         <w:tc>
           <w:tcPr>
-            <w:tcW w:w="1991" w:type="dxa"/>
+            <w:tcW w:w="1990" w:type="dxa"/>
             <w:tcBorders>
               <w:bottom w:val="single" w:sz="4" w:space="0" w:color="000000"/>
             </w:tcBorders>
@@ -10721,7 +10685,7 @@
         </w:tc>
         <w:tc>
           <w:tcPr>
-            <w:tcW w:w="2005" w:type="dxa"/>
+            <w:tcW w:w="2006" w:type="dxa"/>
             <w:tcBorders>
               <w:bottom w:val="single" w:sz="4" w:space="0" w:color="000000"/>
             </w:tcBorders>
@@ -10826,7 +10790,7 @@
         </w:tc>
         <w:tc>
           <w:tcPr>
-            <w:tcW w:w="1989" w:type="dxa"/>
+            <w:tcW w:w="1988" w:type="dxa"/>
             <w:tcBorders/>
           </w:tcPr>
           <w:p>
@@ -10873,7 +10837,7 @@
         </w:tc>
         <w:tc>
           <w:tcPr>
-            <w:tcW w:w="1999" w:type="dxa"/>
+            <w:tcW w:w="2000" w:type="dxa"/>
             <w:tcBorders/>
           </w:tcPr>
           <w:p>
@@ -10920,7 +10884,7 @@
         </w:tc>
         <w:tc>
           <w:tcPr>
-            <w:tcW w:w="1991" w:type="dxa"/>
+            <w:tcW w:w="1990" w:type="dxa"/>
             <w:tcBorders/>
           </w:tcPr>
           <w:p>
@@ -10967,7 +10931,7 @@
         </w:tc>
         <w:tc>
           <w:tcPr>
-            <w:tcW w:w="2005" w:type="dxa"/>
+            <w:tcW w:w="2006" w:type="dxa"/>
             <w:tcBorders/>
           </w:tcPr>
           <w:p>
@@ -11064,7 +11028,7 @@
         </w:tc>
         <w:tc>
           <w:tcPr>
-            <w:tcW w:w="1989" w:type="dxa"/>
+            <w:tcW w:w="1988" w:type="dxa"/>
             <w:tcBorders/>
           </w:tcPr>
           <w:p>
@@ -11111,7 +11075,7 @@
         </w:tc>
         <w:tc>
           <w:tcPr>
-            <w:tcW w:w="1999" w:type="dxa"/>
+            <w:tcW w:w="2000" w:type="dxa"/>
             <w:tcBorders/>
           </w:tcPr>
           <w:p>
@@ -11158,7 +11122,7 @@
         </w:tc>
         <w:tc>
           <w:tcPr>
-            <w:tcW w:w="1991" w:type="dxa"/>
+            <w:tcW w:w="1990" w:type="dxa"/>
             <w:tcBorders/>
           </w:tcPr>
           <w:p>
@@ -11205,7 +11169,7 @@
         </w:tc>
         <w:tc>
           <w:tcPr>
-            <w:tcW w:w="2005" w:type="dxa"/>
+            <w:tcW w:w="2006" w:type="dxa"/>
             <w:tcBorders/>
           </w:tcPr>
           <w:p>
@@ -11302,7 +11266,7 @@
         </w:tc>
         <w:tc>
           <w:tcPr>
-            <w:tcW w:w="1989" w:type="dxa"/>
+            <w:tcW w:w="1988" w:type="dxa"/>
             <w:tcBorders/>
           </w:tcPr>
           <w:p>
@@ -11349,7 +11313,7 @@
         </w:tc>
         <w:tc>
           <w:tcPr>
-            <w:tcW w:w="1999" w:type="dxa"/>
+            <w:tcW w:w="2000" w:type="dxa"/>
             <w:tcBorders/>
           </w:tcPr>
           <w:p>
@@ -11396,7 +11360,7 @@
         </w:tc>
         <w:tc>
           <w:tcPr>
-            <w:tcW w:w="1991" w:type="dxa"/>
+            <w:tcW w:w="1990" w:type="dxa"/>
             <w:tcBorders/>
           </w:tcPr>
           <w:p>
@@ -11443,7 +11407,7 @@
         </w:tc>
         <w:tc>
           <w:tcPr>
-            <w:tcW w:w="2005" w:type="dxa"/>
+            <w:tcW w:w="2006" w:type="dxa"/>
             <w:tcBorders/>
           </w:tcPr>
           <w:p>
@@ -11540,7 +11504,7 @@
         </w:tc>
         <w:tc>
           <w:tcPr>
-            <w:tcW w:w="1989" w:type="dxa"/>
+            <w:tcW w:w="1988" w:type="dxa"/>
             <w:tcBorders/>
           </w:tcPr>
           <w:p>
@@ -11587,7 +11551,7 @@
         </w:tc>
         <w:tc>
           <w:tcPr>
-            <w:tcW w:w="1999" w:type="dxa"/>
+            <w:tcW w:w="2000" w:type="dxa"/>
             <w:tcBorders/>
           </w:tcPr>
           <w:p>
@@ -11634,7 +11598,7 @@
         </w:tc>
         <w:tc>
           <w:tcPr>
-            <w:tcW w:w="1991" w:type="dxa"/>
+            <w:tcW w:w="1990" w:type="dxa"/>
             <w:tcBorders/>
           </w:tcPr>
           <w:p>
@@ -11681,7 +11645,7 @@
         </w:tc>
         <w:tc>
           <w:tcPr>
-            <w:tcW w:w="2005" w:type="dxa"/>
+            <w:tcW w:w="2006" w:type="dxa"/>
             <w:tcBorders/>
           </w:tcPr>
           <w:p>
@@ -11778,7 +11742,7 @@
         </w:tc>
         <w:tc>
           <w:tcPr>
-            <w:tcW w:w="1989" w:type="dxa"/>
+            <w:tcW w:w="1988" w:type="dxa"/>
             <w:tcBorders/>
           </w:tcPr>
           <w:p>
@@ -11825,7 +11789,7 @@
         </w:tc>
         <w:tc>
           <w:tcPr>
-            <w:tcW w:w="1999" w:type="dxa"/>
+            <w:tcW w:w="2000" w:type="dxa"/>
             <w:tcBorders/>
           </w:tcPr>
           <w:p>
@@ -11872,7 +11836,7 @@
         </w:tc>
         <w:tc>
           <w:tcPr>
-            <w:tcW w:w="1991" w:type="dxa"/>
+            <w:tcW w:w="1990" w:type="dxa"/>
             <w:tcBorders/>
           </w:tcPr>
           <w:p>
@@ -11919,7 +11883,7 @@
         </w:tc>
         <w:tc>
           <w:tcPr>
-            <w:tcW w:w="2005" w:type="dxa"/>
+            <w:tcW w:w="2006" w:type="dxa"/>
             <w:tcBorders/>
           </w:tcPr>
           <w:p>
@@ -12016,7 +11980,7 @@
         </w:tc>
         <w:tc>
           <w:tcPr>
-            <w:tcW w:w="1989" w:type="dxa"/>
+            <w:tcW w:w="1988" w:type="dxa"/>
             <w:tcBorders/>
           </w:tcPr>
           <w:p>
@@ -12063,7 +12027,7 @@
         </w:tc>
         <w:tc>
           <w:tcPr>
-            <w:tcW w:w="1999" w:type="dxa"/>
+            <w:tcW w:w="2000" w:type="dxa"/>
             <w:tcBorders/>
           </w:tcPr>
           <w:p>
@@ -12110,7 +12074,7 @@
         </w:tc>
         <w:tc>
           <w:tcPr>
-            <w:tcW w:w="1991" w:type="dxa"/>
+            <w:tcW w:w="1990" w:type="dxa"/>
             <w:tcBorders/>
           </w:tcPr>
           <w:p>
@@ -12157,7 +12121,7 @@
         </w:tc>
         <w:tc>
           <w:tcPr>
-            <w:tcW w:w="2005" w:type="dxa"/>
+            <w:tcW w:w="2006" w:type="dxa"/>
             <w:tcBorders/>
           </w:tcPr>
           <w:p>
@@ -12254,7 +12218,7 @@
         </w:tc>
         <w:tc>
           <w:tcPr>
-            <w:tcW w:w="1989" w:type="dxa"/>
+            <w:tcW w:w="1988" w:type="dxa"/>
             <w:tcBorders/>
           </w:tcPr>
           <w:p>
@@ -12301,7 +12265,7 @@
         </w:tc>
         <w:tc>
           <w:tcPr>
-            <w:tcW w:w="1999" w:type="dxa"/>
+            <w:tcW w:w="2000" w:type="dxa"/>
             <w:tcBorders/>
           </w:tcPr>
           <w:p>
@@ -12348,7 +12312,7 @@
         </w:tc>
         <w:tc>
           <w:tcPr>
-            <w:tcW w:w="1991" w:type="dxa"/>
+            <w:tcW w:w="1990" w:type="dxa"/>
             <w:tcBorders/>
           </w:tcPr>
           <w:p>
@@ -12395,7 +12359,7 @@
         </w:tc>
         <w:tc>
           <w:tcPr>
-            <w:tcW w:w="2005" w:type="dxa"/>
+            <w:tcW w:w="2006" w:type="dxa"/>
             <w:tcBorders/>
           </w:tcPr>
           <w:p>
@@ -12492,7 +12456,7 @@
         </w:tc>
         <w:tc>
           <w:tcPr>
-            <w:tcW w:w="1989" w:type="dxa"/>
+            <w:tcW w:w="1988" w:type="dxa"/>
             <w:tcBorders/>
           </w:tcPr>
           <w:p>
@@ -12539,7 +12503,7 @@
         </w:tc>
         <w:tc>
           <w:tcPr>
-            <w:tcW w:w="1999" w:type="dxa"/>
+            <w:tcW w:w="2000" w:type="dxa"/>
             <w:tcBorders/>
           </w:tcPr>
           <w:p>
@@ -12586,7 +12550,7 @@
         </w:tc>
         <w:tc>
           <w:tcPr>
-            <w:tcW w:w="1991" w:type="dxa"/>
+            <w:tcW w:w="1990" w:type="dxa"/>
             <w:tcBorders/>
           </w:tcPr>
           <w:p>
@@ -12633,7 +12597,7 @@
         </w:tc>
         <w:tc>
           <w:tcPr>
-            <w:tcW w:w="2005" w:type="dxa"/>
+            <w:tcW w:w="2006" w:type="dxa"/>
             <w:tcBorders/>
           </w:tcPr>
           <w:p>
@@ -12732,7 +12696,7 @@
         </w:tc>
         <w:tc>
           <w:tcPr>
-            <w:tcW w:w="1989" w:type="dxa"/>
+            <w:tcW w:w="1988" w:type="dxa"/>
             <w:tcBorders>
               <w:bottom w:val="single" w:sz="6" w:space="0" w:color="000000"/>
             </w:tcBorders>
@@ -12781,7 +12745,7 @@
         </w:tc>
         <w:tc>
           <w:tcPr>
-            <w:tcW w:w="1999" w:type="dxa"/>
+            <w:tcW w:w="2000" w:type="dxa"/>
             <w:tcBorders>
               <w:bottom w:val="single" w:sz="6" w:space="0" w:color="000000"/>
             </w:tcBorders>
@@ -12830,7 +12794,7 @@
         </w:tc>
         <w:tc>
           <w:tcPr>
-            <w:tcW w:w="1991" w:type="dxa"/>
+            <w:tcW w:w="1990" w:type="dxa"/>
             <w:tcBorders>
               <w:bottom w:val="single" w:sz="6" w:space="0" w:color="000000"/>
             </w:tcBorders>
@@ -12879,7 +12843,7 @@
         </w:tc>
         <w:tc>
           <w:tcPr>
-            <w:tcW w:w="2005" w:type="dxa"/>
+            <w:tcW w:w="2006" w:type="dxa"/>
             <w:tcBorders>
               <w:bottom w:val="single" w:sz="6" w:space="0" w:color="000000"/>
             </w:tcBorders>
@@ -14636,7 +14600,7 @@
         </w:rPr>
         <w:fldChar w:fldCharType="separate"/>
       </w:r>
-      <w:bookmarkStart w:id="0" w:name="%25252523jbg12826-bib-0030_R_d188486082e"/>
+      <w:bookmarkStart w:id="0" w:name="%2525252523jbg12826-bib-0030_R_d18848608"/>
       <w:bookmarkEnd w:id="0"/>
       <w:r>
         <w:rPr>
@@ -14757,7 +14721,7 @@
         </w:rPr>
         <w:fldChar w:fldCharType="separate"/>
       </w:r>
-      <w:bookmarkStart w:id="1" w:name="%25252523jbg12826-bib-0049_R_d188486082e"/>
+      <w:bookmarkStart w:id="1" w:name="%2525252523jbg12826-bib-0049_R_d18848608"/>
       <w:bookmarkEnd w:id="1"/>
       <w:r>
         <w:rPr>
@@ -14878,7 +14842,7 @@
         </w:rPr>
         <w:fldChar w:fldCharType="separate"/>
       </w:r>
-      <w:bookmarkStart w:id="2" w:name="%25252523jbg12826-bib-0069_R_d188486082e"/>
+      <w:bookmarkStart w:id="2" w:name="%2525252523jbg12826-bib-0069_R_d18848608"/>
       <w:bookmarkEnd w:id="2"/>
       <w:r>
         <w:rPr>
@@ -15118,7 +15082,7 @@
         </w:rPr>
         <w:fldChar w:fldCharType="separate"/>
       </w:r>
-      <w:bookmarkStart w:id="3" w:name="%25252523jbg12826-bib-0062_R_d188486082e"/>
+      <w:bookmarkStart w:id="3" w:name="%2525252523jbg12826-bib-0062_R_d18848608"/>
       <w:bookmarkEnd w:id="3"/>
       <w:r>
         <w:rPr>
@@ -15239,7 +15203,7 @@
         </w:rPr>
         <w:fldChar w:fldCharType="separate"/>
       </w:r>
-      <w:bookmarkStart w:id="4" w:name="%25252523jbg12826-bib-0083_R_d188486082e"/>
+      <w:bookmarkStart w:id="4" w:name="%2525252523jbg12826-bib-0083_R_d18848608"/>
       <w:bookmarkEnd w:id="4"/>
       <w:r>
         <w:rPr>
@@ -15469,7 +15433,7 @@
         </w:rPr>
         <w:t xml:space="preserve">Abraham, K. J. y Díaz, C. 2014. Identifying large sets of unrelated individuals and unrelated markers. Source Code for biology and Medicine 9 (6). </w:t>
       </w:r>
-      <w:hyperlink r:id="rId6">
+      <w:hyperlink r:id="rId3">
         <w:r>
           <w:rPr>
             <w:rStyle w:val="EnlacedeInternet"/>
@@ -15635,7 +15599,7 @@
         </w:rPr>
         <w:t xml:space="preserve">Bonifazi R. 2023. TuttiFrutti: A Collection of Miscellaneous R Functions and R Scripts. GitHub Repository. DOI: </w:t>
       </w:r>
-      <w:hyperlink r:id="rId7">
+      <w:hyperlink r:id="rId4">
         <w:r>
           <w:rPr>
             <w:rStyle w:val="EnlacedeInternet"/>
@@ -15671,7 +15635,7 @@
         </w:rPr>
         <w:t xml:space="preserve">. Disponible en línea: </w:t>
       </w:r>
-      <w:hyperlink r:id="rId8">
+      <w:hyperlink r:id="rId5">
         <w:r>
           <w:rPr>
             <w:rStyle w:val="EnlacedeInternet"/>
@@ -15740,7 +15704,7 @@
         </w:rPr>
         <w:t xml:space="preserve">Browning, B. L. Zhou, Y. y Browning S. R. 2018. A one-penny imputed genome from next generation reference panels. Am J Hum Genet 103(3):338-348. </w:t>
       </w:r>
-      <w:hyperlink r:id="rId9" w:tgtFrame="_blank">
+      <w:hyperlink r:id="rId6" w:tgtFrame="_blank">
         <w:r>
           <w:rPr>
             <w:rStyle w:val="EnlacedeInternet"/>
@@ -15891,7 +15855,7 @@
         </w:rPr>
         <w:t xml:space="preserve">Using LD structure of several populations to optimize an SNP panel for conservation and selection. Journal of Animal Science 94: 168-169. </w:t>
       </w:r>
-      <w:hyperlink r:id="rId10">
+      <w:hyperlink r:id="rId7">
         <w:r>
           <w:rPr>
             <w:rStyle w:val="EnlacedeInternet"/>
@@ -15977,7 +15941,7 @@
         </w:rPr>
         <w:t xml:space="preserve">Legarra A. y Reverter A. 2018. Semi-parametric estimates of population accuracy and bias of predictions of breeding values and future phenotypes using the LR method. Genet Sel Evol 50(1):53. </w:t>
       </w:r>
-      <w:hyperlink r:id="rId11">
+      <w:hyperlink r:id="rId8">
         <w:r>
           <w:rPr>
             <w:rStyle w:val="EnlacedeInternet"/>
@@ -16109,7 +16073,7 @@
         </w:rPr>
         <w:t xml:space="preserve">5 (3): e9697. </w:t>
       </w:r>
-      <w:hyperlink r:id="rId12">
+      <w:hyperlink r:id="rId9">
         <w:r>
           <w:rPr>
             <w:rStyle w:val="EnlacedeInternet"/>
@@ -16319,7 +16283,7 @@
         </w:rPr>
         <w:t xml:space="preserve">81: 981-94. </w:t>
       </w:r>
-      <w:hyperlink r:id="rId13">
+      <w:hyperlink r:id="rId10">
         <w:r>
           <w:rPr>
             <w:rStyle w:val="EnlacedeInternet"/>
@@ -16422,7 +16386,7 @@
         </w:rPr>
         <w:t xml:space="preserve">. Journal of Applied Gnetics 63: 389-400. </w:t>
       </w:r>
-      <w:hyperlink r:id="rId14">
+      <w:hyperlink r:id="rId11">
         <w:r>
           <w:rPr>
             <w:rStyle w:val="EnlacedeInternet"/>
@@ -16507,7 +16471,7 @@
         </w:rPr>
         <w:t xml:space="preserve">Wu X. L., Li H., Ferretti R., Simpson B., Walker J., Parham J., Mastro L., Qiu J., Schultz T., Tait jr R. G. y Bauck S. 2020. A unified local objective function for optimally selecting SNPs on arrays for agricultural genomics applications. Animal Genetics 51 (2): 306-310. </w:t>
       </w:r>
-      <w:hyperlink r:id="rId15">
+      <w:hyperlink r:id="rId12">
         <w:r>
           <w:rPr>
             <w:rStyle w:val="EnlacedeInternet"/>
@@ -37489,43 +37453,7 @@
           <w:shd w:fill="auto" w:val="clear"/>
           <w:vertAlign w:val="baseline"/>
         </w:rPr>
-        <w:t xml:space="preserve">Tabla </w:t>
-      </w:r>
-      <w:r>
-        <w:rPr>
-          <w:b/>
-          <w:bCs/>
-          <w:i w:val="false"/>
-          <w:caps w:val="false"/>
-          <w:smallCaps w:val="false"/>
-          <w:color w:val="000000"/>
-          <w:spacing w:val="0"/>
-          <w:position w:val="0"/>
-          <w:sz w:val="24"/>
-          <w:sz w:val="24"/>
-          <w:szCs w:val="24"/>
-          <w:shd w:fill="auto" w:val="clear"/>
-          <w:vertAlign w:val="baseline"/>
-        </w:rPr>
-        <w:t>7</w:t>
-      </w:r>
-      <w:r>
-        <w:rPr>
-          <w:b/>
-          <w:bCs/>
-          <w:i w:val="false"/>
-          <w:caps w:val="false"/>
-          <w:smallCaps w:val="false"/>
-          <w:color w:val="000000"/>
-          <w:spacing w:val="0"/>
-          <w:position w:val="0"/>
-          <w:sz w:val="24"/>
-          <w:sz w:val="24"/>
-          <w:szCs w:val="24"/>
-          <w:shd w:fill="auto" w:val="clear"/>
-          <w:vertAlign w:val="baseline"/>
-        </w:rPr>
-        <w:t>.</w:t>
+        <w:t>Tabla 7.</w:t>
       </w:r>
       <w:r>
         <w:rPr>
@@ -40973,11 +40901,7 @@
         </w:rPr>
       </w:pPr>
       <w:r>
-        <w:rPr>
-          <w:sz w:val="20"/>
-          <w:szCs w:val="20"/>
-          <w:shd w:fill="auto" w:val="clear"/>
-        </w:rPr>
+        <w:rPr/>
       </w:r>
     </w:p>
     <w:tbl>
@@ -42233,25 +42157,7 @@
                 <w:szCs w:val="20"/>
                 <w:shd w:fill="auto" w:val="clear"/>
               </w:rPr>
-              <w:t>[</w:t>
-            </w:r>
-            <w:r>
-              <w:rPr>
-                <w:color w:val="000000"/>
-                <w:sz w:val="20"/>
-                <w:szCs w:val="20"/>
-                <w:shd w:fill="auto" w:val="clear"/>
-              </w:rPr>
-              <w:t>0.07;0.10</w:t>
-            </w:r>
-            <w:r>
-              <w:rPr>
-                <w:color w:val="000000"/>
-                <w:sz w:val="20"/>
-                <w:szCs w:val="20"/>
-                <w:shd w:fill="auto" w:val="clear"/>
-              </w:rPr>
-              <w:t>]</w:t>
+              <w:t>[0.07;0.10]</w:t>
             </w:r>
           </w:p>
         </w:tc>
@@ -45764,25 +45670,7 @@
                 <w:szCs w:val="20"/>
                 <w:shd w:fill="auto" w:val="clear"/>
               </w:rPr>
-              <w:t>[</w:t>
-            </w:r>
-            <w:r>
-              <w:rPr>
-                <w:color w:val="000000"/>
-                <w:sz w:val="20"/>
-                <w:szCs w:val="20"/>
-                <w:shd w:fill="auto" w:val="clear"/>
-              </w:rPr>
-              <w:t>0.08;0.11</w:t>
-            </w:r>
-            <w:r>
-              <w:rPr>
-                <w:color w:val="000000"/>
-                <w:sz w:val="20"/>
-                <w:szCs w:val="20"/>
-                <w:shd w:fill="auto" w:val="clear"/>
-              </w:rPr>
-              <w:t>]</w:t>
+              <w:t>[0.08;0.11]</w:t>
             </w:r>
           </w:p>
         </w:tc>
@@ -47989,7 +47877,7 @@
     <w:pPr>
       <w:widowControl/>
       <w:suppressAutoHyphens w:val="true"/>
-      <w:overflowPunct w:val="true"/>
+      <w:overflowPunct w:val="false"/>
       <w:bidi w:val="0"/>
       <w:spacing w:before="0" w:after="0"/>
       <w:jc w:val="left"/>

</xml_diff>